<commit_message>
Weekly GRC run 2026-09-28: 10 cases, 10 risks
</commit_message>
<xml_diff>
--- a/Executive_Reports/Weekly-Reports/Executive_Report_2026-09-28.docx
+++ b/Executive_Reports/Weekly-Reports/Executive_Report_2026-09-28.docx
@@ -959,6 +959,76 @@
         </w:tc>
       </w:tr>
     </w:tbl>
+    <w:p>
+      <w:r>
+        <w:br w:type="page"/>
+      </w:r>
+    </w:p>
+    <w:p>
+      <w:r>
+        <w:rPr>
+          <w:b/>
+          <w:color w:val="1F3864"/>
+          <w:sz w:val="28"/>
+        </w:rPr>
+        <w:t>ADDENDUM — Same-Day Supplemental Update</w:t>
+      </w:r>
+    </w:p>
+    <w:p>
+      <w:r>
+        <w:rPr>
+          <w:i/>
+        </w:rPr>
+        <w:t>Added 2026-09-28, after the report above was first issued, following the operator's request to also cross-reference C:\Projects\Intelligence_Log\ for case triage — a folder outside this task's original two roots, whose access was requested and granted this same day.</w:t>
+      </w:r>
+    </w:p>
+    <w:p>
+      <w:pPr>
+        <w:pStyle w:val="Heading1"/>
+      </w:pPr>
+      <w:r>
+        <w:t>What changed</w:t>
+      </w:r>
+    </w:p>
+    <w:p>
+      <w:r>
+        <w:t>Four additional findings from that log's entries dated 2026-09-21 through 2026-09-25 were verified against primary sources and met this program's logging threshold; none were already captured by the original sweep above. All four are logged register-only (RR-089–RR-092) in risk register version v13 — none were built into full case-study bundles or folded into the narrative sections above, to keep this addendum reviewable as a discrete, clearly bounded unit.</w:t>
+      </w:r>
+    </w:p>
+    <w:p>
+      <w:pPr/>
+      <w:r>
+        <w:t>A widely used web-application framework had a critical, vendor-disclosed remote-code-execution flaw when it renders untrusted input into a generated image — already patched, and no confirmed real-world exploitation found in sources reviewed.</w:t>
+      </w:r>
+    </w:p>
+    <w:p>
+      <w:r>
+        <w:t>A widely deployed webmail platform's unauthenticated database-injection flaw — patched back in May — was confirmed under active exploitation this week by a national cyber-defense agency; this one has a documented history of nation-state targeting and, in this program's judgment, is a strong candidate for a full case-study bundle if the operator wants deeper coverage.</w:t>
+      </w:r>
+    </w:p>
+    <w:p>
+      <w:r>
+        <w:t>A program gap surfaced: a CI/CD platform's critical auth-bypass flaw, added to the federal must-patch list back in August, was missed by this program at the time. It resurfaces this week only because CISA just confirmed ransomware gangs are now actively using it — logged now, dated to that new information, not backdated to August.</w:t>
+      </w:r>
+    </w:p>
+    <w:p>
+      <w:r>
+        <w:t>A major secure file-transfer vendor told customers worldwide to shut down their servers for several hours over the weekend, on law-enforcement intelligence of a possible imminent attack — no confirmed vulnerability or breach, but logged for governance awareness given this product category's history as a ransomware target.</w:t>
+      </w:r>
+    </w:p>
+    <w:p>
+      <w:pPr>
+        <w:pStyle w:val="Heading1"/>
+      </w:pPr>
+      <w:r>
+        <w:t>What this means going forward</w:t>
+      </w:r>
+    </w:p>
+    <w:p>
+      <w:r>
+        <w:t>This program will read C:\Projects\Intelligence_Log\ as a supplementary cross-check source in every future weekly run, per the operator's instruction. Two open items are left for the operator's own judgment rather than decided here: whether the webmail and CI/CD findings above warrant upgrading to full case-study bundles, and whether the CI/CD program gap warrants a spot-check of other recent weeks for similar misses.</w:t>
+      </w:r>
+    </w:p>
     <w:sectPr>
       <w:pgSz w:w="12240" w:h="15840"/>
       <w:pgMar w:top="1440" w:right="1440" w:bottom="1440" w:left="1440" w:header="720" w:footer="720" w:gutter="0"/>

</xml_diff>